<commit_message>
Release 3.0.1: GUI app mode, safer logging, smarter phrase matching
Add tkinter GUI with Start/Stop workflow, robust windowed stdout/stderr handling, and stop/cancel support. Introduce quoted exact-phrase vs unquoted all-words matching, improve scan progress output, and include bundled CA/assets/docs updates for v3 line.

Co-authored-by: Cursor <cursoragent@cursor.com>
</commit_message>
<xml_diff>
--- a/ИНСТРУКЦИЯ.docx
+++ b/ИНСТРУКЦИЯ.docx
@@ -17,7 +17,7 @@
           <w:b/>
           <w:sz w:val="22"/>
         </w:rPr>
-        <w:t>Версия программы: v1.0.1</w:t>
+        <w:t>Версия программы: v3.0.1</w:t>
       </w:r>
     </w:p>
     <w:p>
@@ -26,7 +26,7 @@
           <w:b w:val="0"/>
           <w:sz w:val="22"/>
         </w:rPr>
-        <w:t>Программа ищет заданные слова и фразы на указанных сайтах СМИ и сохраняет результат в Excel-отчёт.</w:t>
+        <w:t>Программа ищет заданные слова и фразы на указанных сайтах СМИ и сохраняет результат в Excel-отчёт. Запуск — окно с кнопками Старт/Стоп (консольный режим: параметр --console).</w:t>
       </w:r>
     </w:p>
     <w:p>
@@ -42,7 +42,7 @@
         <w:pStyle w:val="ListBullet"/>
       </w:pPr>
       <w:r>
-        <w:t>media-monitor.exe — запуск программы</w:t>
+        <w:t>media-monitor-vX.Y.Z.exe — запуск (окно; версия в имени файла)</w:t>
       </w:r>
     </w:p>
     <w:p>
@@ -155,7 +155,7 @@
         <w:pStyle w:val="ListNumber"/>
       </w:pPr>
       <w:r>
-        <w:t>Запустите media-monitor.exe.</w:t>
+        <w:t>Запустите media-monitor-v….exe — откроется окно. Нажмите Старт.</w:t>
       </w:r>
     </w:p>
     <w:p>
@@ -163,23 +163,7 @@
         <w:pStyle w:val="ListNumber"/>
       </w:pPr>
       <w:r>
-        <w:t>Если спросят логин/пароль — можно нажать Enter (пропуск) или ввести данные.</w:t>
-      </w:r>
-    </w:p>
-    <w:p>
-      <w:pPr>
-        <w:pStyle w:val="ListNumber"/>
-      </w:pPr>
-      <w:r>
-        <w:t>Дождитесь окончания. В конце будет «Нажмите Enter…».</w:t>
-      </w:r>
-    </w:p>
-    <w:p>
-      <w:pPr>
-        <w:pStyle w:val="ListNumber"/>
-      </w:pPr>
-      <w:r>
-        <w:t>Откройте свежий файл в папке reports\.</w:t>
+        <w:t>Дождитесь окончания (или Стоп). Отчёт — в папке reports\.</w:t>
       </w:r>
     </w:p>
     <w:p>
@@ -203,7 +187,7 @@
         <w:pStyle w:val="ListBullet"/>
       </w:pPr>
       <w:r>
-        <w:t>Строка в words.txt ищется целиком как фраза (можно несколько слов).</w:t>
+        <w:t>Без кавычек: тройка карта — все слова есть в статье (любой порядок).</w:t>
       </w:r>
     </w:p>
     <w:p>
@@ -211,7 +195,7 @@
         <w:pStyle w:val="ListBullet"/>
       </w:pPr>
       <w:r>
-        <w:t>Кавычки в тексте статьи не мешают: «тройка» тоже найдётся.</w:t>
+        <w:t>В кавычках: "карта Виза принимается в городе" — точная фраза подряд.</w:t>
       </w:r>
     </w:p>
     <w:p>
@@ -220,6 +204,14 @@
       </w:pPr>
       <w:r>
         <w:t>Ищется текст статьи, а не меню/подвал сайта.</w:t>
+      </w:r>
+    </w:p>
+    <w:p>
+      <w:pPr>
+        <w:pStyle w:val="ListBullet"/>
+      </w:pPr>
+      <w:r>
+        <w:t>Сайты сканируются параллельно; внутри одного сайта запросы идут по очереди.</w:t>
       </w:r>
     </w:p>
     <w:p>
@@ -267,7 +259,7 @@
         <w:pStyle w:val="ListBullet"/>
       </w:pPr>
       <w:r>
-        <w:t>max_scan_urls — максимум страниц за запуск. 0 = без лимита.</w:t>
+        <w:t>max_scan_urls — максимум страниц на один сайт. 0 = без лимита.</w:t>
       </w:r>
     </w:p>
     <w:p>
@@ -276,6 +268,38 @@
       </w:pPr>
       <w:r>
         <w:t>max_expand_links — сколько ссылок брать с одной страницы списка/поиска.</w:t>
+      </w:r>
+    </w:p>
+    <w:p>
+      <w:pPr>
+        <w:pStyle w:val="ListBullet"/>
+      </w:pPr>
+      <w:r>
+        <w:t>site_workers — сколько сайтов одновременно (0 = все сразу).</w:t>
+      </w:r>
+    </w:p>
+    <w:p>
+      <w:pPr>
+        <w:pStyle w:val="ListBullet"/>
+      </w:pPr>
+      <w:r>
+        <w:t>log_verbose — 0 только прогресс и HIT, 1 — URL и ошибки.</w:t>
+      </w:r>
+    </w:p>
+    <w:p>
+      <w:pPr>
+        <w:pStyle w:val="ListBullet"/>
+      </w:pPr>
+      <w:r>
+        <w:t>comment_unavailable_sites — 1 закомментировать недоступный сайт в sites.txt (#).</w:t>
+      </w:r>
+    </w:p>
+    <w:p>
+      <w:pPr>
+        <w:pStyle w:val="ListBullet"/>
+      </w:pPr>
+      <w:r>
+        <w:t>ssl_verify — 1 проверять (в exe уже есть CA Минцифры и др.), 0 — не проверять.</w:t>
       </w:r>
     </w:p>
     <w:p>
@@ -366,7 +390,7 @@
         <w:pStyle w:val="ListBullet"/>
       </w:pPr>
       <w:r>
-        <w:t>F1 — версия программы (например v1.0.1)</w:t>
+        <w:t>F1 — версия программы (например v3.0.0)</w:t>
       </w:r>
     </w:p>
     <w:p>
@@ -422,7 +446,7 @@
         <w:pStyle w:val="ListBullet"/>
       </w:pPr>
       <w:r>
-        <w:t>[ssl] … — у сайта проблема с сертификатом; программа повторит запрос без проверки SSL.</w:t>
+        <w:t>[N/M] сайт — N стр., K HIT, время | всего HIT | в работе: … — прогресс.</w:t>
       </w:r>
     </w:p>
     <w:p>
@@ -430,7 +454,7 @@
         <w:pStyle w:val="ListBullet"/>
       </w:pPr>
       <w:r>
-        <w:t>[skip auth] — нужна авторизация, данных нет или они не подошли.</w:t>
+        <w:t>[N/M] недоступен сайт — сайт недоступен (в Excel красным; строка в sites.txt с #).</w:t>
       </w:r>
     </w:p>
     <w:p>
@@ -438,7 +462,7 @@
         <w:pStyle w:val="ListBullet"/>
       </w:pPr>
       <w:r>
-        <w:t>[warn] cannot expand … — не удалось взять список ссылок со страницы.</w:t>
+        <w:t>HIT [сайт] «фраза» url — находка.</w:t>
       </w:r>
     </w:p>
     <w:p>
@@ -446,7 +470,7 @@
         <w:pStyle w:val="ListBullet"/>
       </w:pPr>
       <w:r>
-        <w:t>[error] … — ошибка загрузки конкретной страницы.</w:t>
+        <w:t>log_verbose=1 — показать URL, SSL, ошибки (по умолчанию скрыты).</w:t>
       </w:r>
     </w:p>
     <w:p>
@@ -491,6 +515,14 @@
     </w:p>
     <w:p>
       <w:pPr>
+        <w:pStyle w:val="ListBullet"/>
+      </w:pPr>
+      <w:r>
+        <w:t>Если сайт режет по частоте запросов — поставьте site_workers=8.</w:t>
+      </w:r>
+    </w:p>
+    <w:p>
+      <w:pPr>
         <w:pStyle w:val="Heading1"/>
       </w:pPr>
       <w:r>
@@ -503,7 +535,7 @@
           <w:b w:val="0"/>
           <w:sz w:val="22"/>
         </w:rPr>
-        <w:t>Программа работает последовательно (сайт за сайтом, страница за страницей). На каждый сайт обычно приходится: главная + несколько страниц поиска + найденные статьи.</w:t>
+        <w:t>Сайты идут параллельно, внутри сайта — по одному запросу. Время прогона близко к самому медленному сайту, а не к сумме всех.</w:t>
       </w:r>
     </w:p>
     <w:p>
@@ -511,7 +543,7 @@
         <w:pStyle w:val="ListBullet"/>
       </w:pPr>
       <w:r>
-        <w:t>Ориентир на 1 сайт и 1–2 слова: примерно 1–5 минут (зависит от скорости сайта и числа статей).</w:t>
+        <w:t>1 сайт, 1–2 слова: обычно 1–5 минут.</w:t>
       </w:r>
     </w:p>
     <w:p>
@@ -519,7 +551,7 @@
         <w:pStyle w:val="ListBullet"/>
       </w:pPr>
       <w:r>
-        <w:t>Ориентир на 130 сайтов и 1–3 слова: обычно от 2–4 часов до 6–10 часов.</w:t>
+        <w:t>130 сайтов, 1–3 слова: часто десятки минут вместо многих часов (зависит от самых медленных).</w:t>
       </w:r>
     </w:p>
     <w:p>
@@ -527,7 +559,7 @@
         <w:pStyle w:val="ListBullet"/>
       </w:pPr>
       <w:r>
-        <w:t>Если много слов и max_scan_urls=0 (без лимита), время может вырасти сильнее.</w:t>
+        <w:t>max_scan_urls ограничивает страницы на каждый сайт отдельно.</w:t>
       </w:r>
     </w:p>
     <w:p>
@@ -535,7 +567,7 @@
         <w:pStyle w:val="ListBullet"/>
       </w:pPr>
       <w:r>
-        <w:t>Медленные сайты, SSL-ошибки и таймауты (до ~25 сек на страницу) удлиняют прогон.</w:t>
+        <w:t>Медленные сайты и таймауты (до ~25 сек на страницу) удлиняют прогон.</w:t>
       </w:r>
     </w:p>
     <w:p>
@@ -544,7 +576,7 @@
           <w:b/>
           <w:sz w:val="22"/>
         </w:rPr>
-        <w:t>Текущий релиз: v1.0.1</w:t>
+        <w:t>Текущий релиз: v3.0.1</w:t>
       </w:r>
     </w:p>
     <w:sectPr>

</xml_diff>

<commit_message>
Release 3.1.0: cleaner status log and recent-days date override
- Hide per-hit spam from normal output (status-focused console/UI)\n- Add article_date_last_days setting to override both date bounds when non-zero\n- Update settings/examples and user docs for new date mode and logging behavior

Co-authored-by: arma35 <arma35@users.noreply.github.com>
</commit_message>
<xml_diff>
--- a/ИНСТРУКЦИЯ.docx
+++ b/ИНСТРУКЦИЯ.docx
@@ -17,7 +17,7 @@
           <w:b/>
           <w:sz w:val="22"/>
         </w:rPr>
-        <w:t>Версия программы: v3.0.1</w:t>
+        <w:t>Версия программы: v3.1.0</w:t>
       </w:r>
     </w:p>
     <w:p>
@@ -251,6 +251,14 @@
         <w:pStyle w:val="ListBullet"/>
       </w:pPr>
       <w:r>
+        <w:t>article_date_last_days — за сколько последних дней от сегодня искать; если &gt;0, перекрывает оба параметра дат.</w:t>
+      </w:r>
+    </w:p>
+    <w:p>
+      <w:pPr>
+        <w:pStyle w:val="ListBullet"/>
+      </w:pPr>
+      <w:r>
         <w:t>auth_timeout_seconds — сколько секунд ждать логин/пароль при старте.</w:t>
       </w:r>
     </w:p>
@@ -283,7 +291,7 @@
         <w:pStyle w:val="ListBullet"/>
       </w:pPr>
       <w:r>
-        <w:t>log_verbose — 0 только прогресс и HIT, 1 — URL и ошибки.</w:t>
+        <w:t>log_verbose — 0 только статус этапов, 1 — URL и ошибки.</w:t>
       </w:r>
     </w:p>
     <w:p>
@@ -576,7 +584,7 @@
           <w:b/>
           <w:sz w:val="22"/>
         </w:rPr>
-        <w:t>Текущий релиз: v3.0.1</w:t>
+        <w:t>Текущий релиз: v3.1.0</w:t>
       </w:r>
     </w:p>
     <w:sectPr>

</xml_diff>

<commit_message>
Release 3.1.1: GUI date range and drop app-folder button
Show computed article from/to dates in the UI from the three
settings date parameters; remove the unused program-folder button.

Co-authored-by: arma35 <arma35@users.noreply.github.com>
</commit_message>
<xml_diff>
--- a/ИНСТРУКЦИЯ.docx
+++ b/ИНСТРУКЦИЯ.docx
@@ -17,7 +17,7 @@
           <w:b/>
           <w:sz w:val="22"/>
         </w:rPr>
-        <w:t>Версия программы: v3.1.0</w:t>
+        <w:t>Версия программы: v3.1.1</w:t>
       </w:r>
     </w:p>
     <w:p>
@@ -584,7 +584,7 @@
           <w:b/>
           <w:sz w:val="22"/>
         </w:rPr>
-        <w:t>Текущий релиз: v3.1.0</w:t>
+        <w:t>Текущий релиз: v3.1.1</w:t>
       </w:r>
     </w:p>
     <w:sectPr>

</xml_diff>

<commit_message>
Release 3.1.2: windowed GUI build (no black console)
CI PyInstaller now uses --windowed like build.bat so the GUI
exe does not open a duplicate console log window.

Co-authored-by: arma35 <arma35@users.noreply.github.com>
</commit_message>
<xml_diff>
--- a/ИНСТРУКЦИЯ.docx
+++ b/ИНСТРУКЦИЯ.docx
@@ -17,7 +17,7 @@
           <w:b/>
           <w:sz w:val="22"/>
         </w:rPr>
-        <w:t>Версия программы: v3.1.1</w:t>
+        <w:t>Версия программы: v3.1.2</w:t>
       </w:r>
     </w:p>
     <w:p>
@@ -584,7 +584,7 @@
           <w:b/>
           <w:sz w:val="22"/>
         </w:rPr>
-        <w:t>Текущий релиз: v3.1.1</w:t>
+        <w:t>Текущий релиз: v3.1.2</w:t>
       </w:r>
     </w:p>
     <w:sectPr>

</xml_diff>

<commit_message>
Release 3.2.1: faster Stop and elapsed timer
On Stop, close live HTTP sessions and abort URL discovery so
workers do not sit on read timeouts for minutes. Show a live
elapsed timer in the GUI from Start.

Co-authored-by: arma35 <arma35@users.noreply.github.com>
</commit_message>
<xml_diff>
--- a/ИНСТРУКЦИЯ.docx
+++ b/ИНСТРУКЦИЯ.docx
@@ -17,7 +17,7 @@
           <w:b/>
           <w:sz w:val="22"/>
         </w:rPr>
-        <w:t>Версия программы: v3.1.2</w:t>
+        <w:t>Версия программы: v3.2.1</w:t>
       </w:r>
     </w:p>
     <w:p>
@@ -454,7 +454,7 @@
         <w:pStyle w:val="ListBullet"/>
       </w:pPr>
       <w:r>
-        <w:t>[N/M] сайт — N стр., K HIT, время | всего HIT | в работе: … — прогресс.</w:t>
+        <w:t>[N/M] готово сайт — сайт закончен (N = сколько сайтов уже завершено из M).</w:t>
       </w:r>
     </w:p>
     <w:p>
@@ -470,7 +470,15 @@
         <w:pStyle w:val="ListBullet"/>
       </w:pPr>
       <w:r>
-        <w:t>HIT [сайт] «фраза» url — находка.</w:t>
+        <w:t>[N/M] остановлен сайт — прерван кнопкой Стоп.</w:t>
+      </w:r>
+    </w:p>
+    <w:p>
+      <w:pPr>
+        <w:pStyle w:val="ListBullet"/>
+      </w:pPr>
+      <w:r>
+        <w:t>В верхней панели: готово N/M, находок, сколько сайтов сейчас качаются, параллельно.</w:t>
       </w:r>
     </w:p>
     <w:p>
@@ -479,6 +487,23 @@
       </w:pPr>
       <w:r>
         <w:t>log_verbose=1 — показать URL, SSL, ошибки (по умолчанию скрыты).</w:t>
+      </w:r>
+    </w:p>
+    <w:p>
+      <w:pPr>
+        <w:pStyle w:val="Heading1"/>
+      </w:pPr>
+      <w:r>
+        <w:t>8a. Кнопка Стоп</w:t>
+      </w:r>
+    </w:p>
+    <w:p>
+      <w:r>
+        <w:rPr>
+          <w:b w:val="0"/>
+          <w:sz w:val="22"/>
+        </w:rPr>
+        <w:t>Мягкая остановка: текущий сетевой запрос дожидается ответа, новые страницы не берутся. Excel всё равно сохраняется с тем, что успели найти.</w:t>
       </w:r>
     </w:p>
     <w:p>
@@ -584,7 +609,7 @@
           <w:b/>
           <w:sz w:val="22"/>
         </w:rPr>
-        <w:t>Текущий релиз: v3.2.0</w:t>
+        <w:t>Текущий релиз: v3.2.1</w:t>
       </w:r>
     </w:p>
     <w:sectPr>

</xml_diff>

<commit_message>
Release 3.2.2: auto-open Excel report when scan finishes
After writing the report, open it with the OS default app so the
user sees results immediately.

Co-authored-by: arma35 <arma35@users.noreply.github.com>
</commit_message>
<xml_diff>
--- a/ИНСТРУКЦИЯ.docx
+++ b/ИНСТРУКЦИЯ.docx
@@ -17,7 +17,7 @@
           <w:b/>
           <w:sz w:val="22"/>
         </w:rPr>
-        <w:t>Версия программы: v3.2.1</w:t>
+        <w:t>Версия программы: v3.2.2</w:t>
       </w:r>
     </w:p>
     <w:p>
@@ -609,7 +609,7 @@
           <w:b/>
           <w:sz w:val="22"/>
         </w:rPr>
-        <w:t>Текущий релиз: v3.2.1</w:t>
+        <w:t>Текущий релиз: v3.2.2</w:t>
       </w:r>
     </w:p>
     <w:sectPr>

</xml_diff>

<commit_message>
Release 3.3.0: Status and Full log tabs in GUI
Add a notebook with a clean Status tab and a Full log tab that
always shows live URL/search/HIT detail without cluttering the
main status view.

Co-authored-by: arma35 <arma35@users.noreply.github.com>
</commit_message>
<xml_diff>
--- a/ИНСТРУКЦИЯ.docx
+++ b/ИНСТРУКЦИЯ.docx
@@ -17,7 +17,7 @@
           <w:b/>
           <w:sz w:val="22"/>
         </w:rPr>
-        <w:t>Версия программы: v3.2.2</w:t>
+        <w:t>Версия программы: v3.3.0</w:t>
       </w:r>
     </w:p>
     <w:p>
@@ -609,7 +609,7 @@
           <w:b/>
           <w:sz w:val="22"/>
         </w:rPr>
-        <w:t>Текущий релиз: v3.2.2</w:t>
+        <w:t>Текущий релиз: v3.3.0</w:t>
       </w:r>
     </w:p>
     <w:sectPr>

</xml_diff>

<commit_message>
Release 3.3.1: fix article dates on dostup1-like pages
Prefer .subtitle__date and other article date blocks over feed
widgets with «сегодня». Absolute Russian dates like
«27 декабря 2024 года, 20:27» are parsed correctly.

Co-authored-by: arma35 <arma35@users.noreply.github.com>
</commit_message>
<xml_diff>
--- a/ИНСТРУКЦИЯ.docx
+++ b/ИНСТРУКЦИЯ.docx
@@ -17,7 +17,7 @@
           <w:b/>
           <w:sz w:val="22"/>
         </w:rPr>
-        <w:t>Версия программы: v3.3.0</w:t>
+        <w:t>Версия программы: v3.3.1</w:t>
       </w:r>
     </w:p>
     <w:p>
@@ -609,7 +609,7 @@
           <w:b/>
           <w:sz w:val="22"/>
         </w:rPr>
-        <w:t>Текущий релиз: v3.3.0</w:t>
+        <w:t>Текущий релиз: v3.3.1</w:t>
       </w:r>
     </w:p>
     <w:sectPr>

</xml_diff>

<commit_message>
Release 3.3.2: red commented sites at report end, full file log
Append all #-commented sites as red rows after found hits.
Always write detailed run output to media-monitor_log.txt.

Co-authored-by: arma35 <arma35@users.noreply.github.com>
</commit_message>
<xml_diff>
--- a/ИНСТРУКЦИЯ.docx
+++ b/ИНСТРУКЦИЯ.docx
@@ -17,7 +17,7 @@
           <w:b/>
           <w:sz w:val="22"/>
         </w:rPr>
-        <w:t>Версия программы: v3.3.1</w:t>
+        <w:t>Версия программы: v3.3.2</w:t>
       </w:r>
     </w:p>
     <w:p>
@@ -609,7 +609,7 @@
           <w:b/>
           <w:sz w:val="22"/>
         </w:rPr>
-        <w:t>Текущий релиз: v3.3.1</w:t>
+        <w:t>Текущий релиз: v3.3.2</w:t>
       </w:r>
     </w:p>
     <w:sectPr>

</xml_diff>

<commit_message>
Release 3.3.3: ignore news-ticker dates when parsing articles
Article publish dates were often replaced by «today» from
sidebar/ticker <time> tags (e.g. vestniksr.ru). Prefer
article chrome (.bi_date_pub, .subtitle__date) and skip junk.

Co-authored-by: arma35 <arma35@users.noreply.github.com>
</commit_message>
<xml_diff>
--- a/ИНСТРУКЦИЯ.docx
+++ b/ИНСТРУКЦИЯ.docx
@@ -17,7 +17,7 @@
           <w:b/>
           <w:sz w:val="22"/>
         </w:rPr>
-        <w:t>Версия программы: v3.3.2</w:t>
+        <w:t>Версия программы: v3.3.3</w:t>
       </w:r>
     </w:p>
     <w:p>
@@ -609,7 +609,7 @@
           <w:b/>
           <w:sz w:val="22"/>
         </w:rPr>
-        <w:t>Текущий релиз: v3.3.2</w:t>
+        <w:t>Текущий релиз: v3.3.3</w:t>
       </w:r>
     </w:p>
     <w:sectPr>

</xml_diff>

<commit_message>
Release 4.0.0: SQLite scan cache to skip already-checked pages
Add scan_cache.sqlite next to the exe and skip_seen_days setting
(default 30). URLs checked with the same words.txt fingerprint are
not re-fetched within N days; changing keywords invalidates the cache.

Co-authored-by: arma35 <arma35@users.noreply.github.com>
</commit_message>
<xml_diff>
--- a/ИНСТРУКЦИЯ.docx
+++ b/ИНСТРУКЦИЯ.docx
@@ -17,7 +17,7 @@
           <w:b/>
           <w:sz w:val="22"/>
         </w:rPr>
-        <w:t>Версия программы: v3.3.3</w:t>
+        <w:t>Версия программы: v4.0.0</w:t>
       </w:r>
     </w:p>
     <w:p>
@@ -26,7 +26,7 @@
           <w:b w:val="0"/>
           <w:sz w:val="22"/>
         </w:rPr>
-        <w:t>Программа ищет заданные слова и фразы на указанных сайтах СМИ и сохраняет результат в Excel-отчёт. Запуск — окно с кнопками Старт/Стоп (консольный режим: параметр --console).</w:t>
+        <w:t>Программа ищет заданные слова и фразы на указанных сайтах СМИ и сохраняет результат в Excel-отчёт. Запуск — окно с кнопками Старт/Стоп (консольный режим: параметр --console). С версии 4.0 просмотренные страницы запоминаются в scan_cache.sqlite.</w:t>
       </w:r>
     </w:p>
     <w:p>
@@ -66,7 +66,7 @@
         <w:pStyle w:val="ListBullet"/>
       </w:pPr>
       <w:r>
-        <w:t>settings.txt — настройки (даты, лимиты)</w:t>
+        <w:t>settings.txt — настройки (даты, лимиты, кэш)</w:t>
       </w:r>
     </w:p>
     <w:p>
@@ -75,6 +75,14 @@
       </w:pPr>
       <w:r>
         <w:t>exclude.txt — ссылки, которые не должны попадать в отчёт</w:t>
+      </w:r>
+    </w:p>
+    <w:p>
+      <w:pPr>
+        <w:pStyle w:val="ListBullet"/>
+      </w:pPr>
+      <w:r>
+        <w:t>scan_cache.sqlite — кэш уже проверенных страниц (создаётся сам)</w:t>
       </w:r>
     </w:p>
     <w:p>
@@ -283,6 +291,14 @@
         <w:pStyle w:val="ListBullet"/>
       </w:pPr>
       <w:r>
+        <w:t>skip_seen_days — не сканировать повторно URL из кэша за последние N дней (0 = выкл.).</w:t>
+      </w:r>
+    </w:p>
+    <w:p>
+      <w:pPr>
+        <w:pStyle w:val="ListBullet"/>
+      </w:pPr>
+      <w:r>
         <w:t>site_workers — сколько сайтов одновременно (0 = все сразу).</w:t>
       </w:r>
     </w:p>
@@ -317,6 +333,54 @@
           <w:sz w:val="22"/>
         </w:rPr>
         <w:t>Если дата статьи найдена и она вне диапазона — статья не попадёт в отчёт. Если дата не найдена — статья всё равно попадёт (ячейка даты будет пустой).</w:t>
+      </w:r>
+    </w:p>
+    <w:p>
+      <w:pPr>
+        <w:pStyle w:val="Heading1"/>
+      </w:pPr>
+      <w:r>
+        <w:t>4a. Кэш страниц (scan_cache.sqlite)</w:t>
+      </w:r>
+    </w:p>
+    <w:p>
+      <w:pPr>
+        <w:pStyle w:val="ListBullet"/>
+      </w:pPr>
+      <w:r>
+        <w:t>Файл создаётся рядом с exe автоматически.</w:t>
+      </w:r>
+    </w:p>
+    <w:p>
+      <w:pPr>
+        <w:pStyle w:val="ListBullet"/>
+      </w:pPr>
+      <w:r>
+        <w:t>При skip_seen_days&gt;0 повторный прогон не качает уже проверенные URL.</w:t>
+      </w:r>
+    </w:p>
+    <w:p>
+      <w:pPr>
+        <w:pStyle w:val="ListBullet"/>
+      </w:pPr>
+      <w:r>
+        <w:t>Смена words.txt — страницы сканируются снова (другой fingerprint фраз).</w:t>
+      </w:r>
+    </w:p>
+    <w:p>
+      <w:pPr>
+        <w:pStyle w:val="ListBullet"/>
+      </w:pPr>
+      <w:r>
+        <w:t>Сброс: удалите scan_cache.sqlite или поставьте skip_seen_days=0.</w:t>
+      </w:r>
+    </w:p>
+    <w:p>
+      <w:pPr>
+        <w:pStyle w:val="ListBullet"/>
+      </w:pPr>
+      <w:r>
+        <w:t>Совет: первый прогон с большим max_expand_links (например 1000), потом можно уменьшить.</w:t>
       </w:r>
     </w:p>
     <w:p>
@@ -600,6 +664,14 @@
         <w:pStyle w:val="ListBullet"/>
       </w:pPr>
       <w:r>
+        <w:t>skip_seen_days и scan_cache.sqlite ускоряют повторные прогоны.</w:t>
+      </w:r>
+    </w:p>
+    <w:p>
+      <w:pPr>
+        <w:pStyle w:val="ListBullet"/>
+      </w:pPr>
+      <w:r>
         <w:t>Медленные сайты и таймауты (до ~25 сек на страницу) удлиняют прогон.</w:t>
       </w:r>
     </w:p>
@@ -609,7 +681,7 @@
           <w:b/>
           <w:sz w:val="22"/>
         </w:rPr>
-        <w:t>Текущий релиз: v3.3.3</w:t>
+        <w:t>Текущий релиз: v4.0.0</w:t>
       </w:r>
     </w:p>
     <w:sectPr>

</xml_diff>

<commit_message>
Docs: expand v4.0.0 instructions for scan cache and messages
Document skip_seen_days, [cache] log lines, auto-append of new
settings keys, and first-run max_expand_links tip in txt/docx.

Co-authored-by: arma35 <arma35@users.noreply.github.com>
</commit_message>
<xml_diff>
--- a/ИНСТРУКЦИЯ.docx
+++ b/ИНСТРУКЦИЯ.docx
@@ -106,7 +106,7 @@
         <w:pStyle w:val="ListBullet"/>
       </w:pPr>
       <w:r>
-        <w:t>media-monitor_log.txt — лог работы (то же, что в консоли)</w:t>
+        <w:t>media-monitor_log.txt — лог работы</w:t>
       </w:r>
     </w:p>
     <w:p>
@@ -114,7 +114,7 @@
         <w:pStyle w:val="ListBullet"/>
       </w:pPr>
       <w:r>
-        <w:t>ИНСТРУКЦИЯ.docx — эта инструкция</w:t>
+        <w:t>ИНСТРУКЦИЯ.docx / ИНСТРУКЦИЯ.txt — эта инструкция</w:t>
       </w:r>
     </w:p>
     <w:p>
@@ -155,7 +155,7 @@
         <w:pStyle w:val="ListNumber"/>
       </w:pPr>
       <w:r>
-        <w:t>При необходимости настройте settings.txt (см. раздел 4).</w:t>
+        <w:t>При необходимости настройте settings.txt (см. раздел 4), в т.ч. skip_seen_days и max_expand_links.</w:t>
       </w:r>
     </w:p>
     <w:p>
@@ -239,6 +239,15 @@
       </w:r>
     </w:p>
     <w:p>
+      <w:r>
+        <w:rPr>
+          <w:b w:val="0"/>
+          <w:sz w:val="22"/>
+        </w:rPr>
+        <w:t>При обновлении с v3 программа сама допишет новые ключи в ваш settings.txt (уже заданные значения не меняет).</w:t>
+      </w:r>
+    </w:p>
+    <w:p>
       <w:pPr>
         <w:pStyle w:val="ListBullet"/>
       </w:pPr>
@@ -251,7 +260,7 @@
         <w:pStyle w:val="ListBullet"/>
       </w:pPr>
       <w:r>
-        <w:t>article_date_not_older_than — дата НЕ СТАРШЕ. Пример 2026-01-01 — только с этой даты и новее. Пусто = без нижней границы.</w:t>
+        <w:t>article_date_not_older_than — дата НЕ СТАРШЕ. Пусто = без нижней границы.</w:t>
       </w:r>
     </w:p>
     <w:p>
@@ -283,7 +292,7 @@
         <w:pStyle w:val="ListBullet"/>
       </w:pPr>
       <w:r>
-        <w:t>max_expand_links — сколько ссылок брать с одной страницы списка/поиска.</w:t>
+        <w:t>max_expand_links — сколько ссылок брать с одной страницы списка/поиска (это не фильтр по дате).</w:t>
       </w:r>
     </w:p>
     <w:p>
@@ -364,6 +373,22 @@
         <w:pStyle w:val="ListBullet"/>
       </w:pPr>
       <w:r>
+        <w:t>В полном логе: [cache] уже смотрели: URL.</w:t>
+      </w:r>
+    </w:p>
+    <w:p>
+      <w:pPr>
+        <w:pStyle w:val="ListBullet"/>
+      </w:pPr>
+      <w:r>
+        <w:t>В строке «готово» и в итоге: кэш-пропуск N.</w:t>
+      </w:r>
+    </w:p>
+    <w:p>
+      <w:pPr>
+        <w:pStyle w:val="ListBullet"/>
+      </w:pPr>
+      <w:r>
         <w:t>Смена words.txt — страницы сканируются снова (другой fingerprint фраз).</w:t>
       </w:r>
     </w:p>
@@ -380,7 +405,7 @@
         <w:pStyle w:val="ListBullet"/>
       </w:pPr>
       <w:r>
-        <w:t>Совет: первый прогон с большим max_expand_links (например 1000), потом можно уменьшить.</w:t>
+        <w:t>Совет: первый прогон с большим max_expand_links (например 1000), потом можно 100–120.</w:t>
       </w:r>
     </w:p>
     <w:p>
@@ -462,7 +487,7 @@
         <w:pStyle w:val="ListBullet"/>
       </w:pPr>
       <w:r>
-        <w:t>F1 — версия программы (например v3.0.0)</w:t>
+        <w:t>F1 — версия программы (например v4.0.0)</w:t>
       </w:r>
     </w:p>
     <w:p>
@@ -471,6 +496,14 @@
       </w:pPr>
       <w:r>
         <w:t>G1 — длительность генерации отчёта (например 12м 35с)</w:t>
+      </w:r>
+    </w:p>
+    <w:p>
+      <w:pPr>
+        <w:pStyle w:val="ListBullet"/>
+      </w:pPr>
+      <w:r>
+        <w:t>В конце красным — недоступные и все #-закомментированные сайты из sites.txt.</w:t>
       </w:r>
     </w:p>
     <w:p>
@@ -494,7 +527,7 @@
         <w:pStyle w:val="ListBullet"/>
       </w:pPr>
       <w:r>
-        <w:t>Пишется то же, что видно в консоли.</w:t>
+        <w:t>Пишется полный ход работы (включая детальный лог URL и [cache]).</w:t>
       </w:r>
     </w:p>
     <w:p>
@@ -518,7 +551,7 @@
         <w:pStyle w:val="ListBullet"/>
       </w:pPr>
       <w:r>
-        <w:t>[N/M] готово сайт — сайт закончен (N = сколько сайтов уже завершено из M).</w:t>
+        <w:t>[N/M] готово сайт — … стр., кэш-пропуск N, … находок — сайт закончен.</w:t>
       </w:r>
     </w:p>
     <w:p>
@@ -542,6 +575,30 @@
         <w:pStyle w:val="ListBullet"/>
       </w:pPr>
       <w:r>
+        <w:t>[cache] уже смотрели: URL — страница пропущена по кэшу (без HTTP).</w:t>
+      </w:r>
+    </w:p>
+    <w:p>
+      <w:pPr>
+        <w:pStyle w:val="ListBullet"/>
+      </w:pPr>
+      <w:r>
+        <w:t>Кэш: scan_cache.sqlite (N стр.), не сканировать повторно 30 дн. — кэш включён.</w:t>
+      </w:r>
+    </w:p>
+    <w:p>
+      <w:pPr>
+        <w:pStyle w:val="ListBullet"/>
+      </w:pPr>
+      <w:r>
+        <w:t>Итог: …, кэш-пропуск N — сколько URL не качали повторно.</w:t>
+      </w:r>
+    </w:p>
+    <w:p>
+      <w:pPr>
+        <w:pStyle w:val="ListBullet"/>
+      </w:pPr>
+      <w:r>
         <w:t>В верхней панели: готово N/M, находок, сколько сайтов сейчас качаются, параллельно.</w:t>
       </w:r>
     </w:p>
@@ -550,7 +607,7 @@
         <w:pStyle w:val="ListBullet"/>
       </w:pPr>
       <w:r>
-        <w:t>log_verbose=1 — показать URL, SSL, ошибки (по умолчанию скрыты).</w:t>
+        <w:t>log_verbose=1 — показать URL, SSL, ошибки (по умолчанию скрыты в статусе).</w:t>
       </w:r>
     </w:p>
     <w:p>
@@ -567,7 +624,7 @@
           <w:b w:val="0"/>
           <w:sz w:val="22"/>
         </w:rPr>
-        <w:t>Мягкая остановка: текущий сетевой запрос дожидается ответа, новые страницы не берутся. Excel всё равно сохраняется с тем, что успели найти.</w:t>
+        <w:t>Мягкая остановка: сеть закрывается сразу, новые страницы не берутся. Excel всё равно сохраняется с тем, что успели найти.</w:t>
       </w:r>
     </w:p>
     <w:p>
@@ -599,7 +656,7 @@
         <w:pStyle w:val="ListBullet"/>
       </w:pPr>
       <w:r>
-        <w:t>После обновления exe ваши txt-конфиги не затираются.</w:t>
+        <w:t>После обновления exe ваши txt-конфиги не затираются; новые ключи settings допишутся сами.</w:t>
       </w:r>
     </w:p>
     <w:p>
@@ -616,6 +673,14 @@
       </w:pPr>
       <w:r>
         <w:t>Если сайт режет по частоте запросов — поставьте site_workers=8.</w:t>
+      </w:r>
+    </w:p>
+    <w:p>
+      <w:pPr>
+        <w:pStyle w:val="ListBullet"/>
+      </w:pPr>
+      <w:r>
+        <w:t>Первый широкий прогон: max_expand_links=1000; потом, с наполненным кэшем, можно уменьшить.</w:t>
       </w:r>
     </w:p>
     <w:p>

</xml_diff>

<commit_message>
Release 4.0.1: fix Cyrillic zip names and startup freeze
- Pack zip with UTF-8 filename flag (no ИНСТРУКЦИЯ → ╨Ш╨Э╨б… mojibake)
- Switch PyInstaller to onedir so the GUI opens in seconds
- Bound GUI log drain so detail floods cannot freeze the window
- Ship INSTRUCTION.* ASCII copies alongside ИНСТРУКЦИЯ.*

Co-authored-by: arma35 <arma35@users.noreply.github.com>
</commit_message>
<xml_diff>
--- a/ИНСТРУКЦИЯ.docx
+++ b/ИНСТРУКЦИЯ.docx
@@ -17,7 +17,7 @@
           <w:b/>
           <w:sz w:val="22"/>
         </w:rPr>
-        <w:t>Версия программы: v4.0.0</w:t>
+        <w:t>Версия программы: v4.0.1</w:t>
       </w:r>
     </w:p>
     <w:p>
@@ -26,7 +26,7 @@
           <w:b w:val="0"/>
           <w:sz w:val="22"/>
         </w:rPr>
-        <w:t>Программа ищет заданные слова и фразы на указанных сайтах СМИ и сохраняет результат в Excel-отчёт. Запуск — окно с кнопками Старт/Стоп (консольный режим: параметр --console). С версии 4.0 просмотренные страницы запоминаются в scan_cache.sqlite.</w:t>
+        <w:t>Программа ищет заданные слова и фразы на указанных сайтах СМИ и сохраняет результат в Excel-отчёт. Запуск — окно с кнопками Старт/Стоп (консольный режим: параметр --console). С версии 4.0 просмотренные страницы запоминаются в scan_cache.sqlite. С 4.0.1 сборка onedir: распакуйте zip целиком (папка _internal обязательна) — окно открывается за секунды, без долгого зависания onefile.</w:t>
       </w:r>
     </w:p>
     <w:p>
@@ -43,6 +43,22 @@
       </w:pPr>
       <w:r>
         <w:t>media-monitor-vX.Y.Z.exe — запуск (окно; версия в имени файла)</w:t>
+      </w:r>
+    </w:p>
+    <w:p>
+      <w:pPr>
+        <w:pStyle w:val="ListBullet"/>
+      </w:pPr>
+      <w:r>
+        <w:t>_internal\ — служебные библиотеки рядом с exe (не удалять)</w:t>
+      </w:r>
+    </w:p>
+    <w:p>
+      <w:pPr>
+        <w:pStyle w:val="ListBullet"/>
+      </w:pPr>
+      <w:r>
+        <w:t>INSTRUCTION.txt / INSTRUCTION.docx — та же инструкция латиницей</w:t>
       </w:r>
     </w:p>
     <w:p>
@@ -156,6 +172,14 @@
       </w:pPr>
       <w:r>
         <w:t>При необходимости настройте settings.txt (см. раздел 4), в т.ч. skip_seen_days и max_expand_links.</w:t>
+      </w:r>
+    </w:p>
+    <w:p>
+      <w:pPr>
+        <w:pStyle w:val="ListNumber"/>
+      </w:pPr>
+      <w:r>
+        <w:t>Распакуйте zip в папку (не запускайте из архива).</w:t>
       </w:r>
     </w:p>
     <w:p>
@@ -487,7 +511,7 @@
         <w:pStyle w:val="ListBullet"/>
       </w:pPr>
       <w:r>
-        <w:t>F1 — версия программы (например v4.0.0)</w:t>
+        <w:t>F1 — версия программы (например v4.0.1)</w:t>
       </w:r>
     </w:p>
     <w:p>
@@ -746,7 +770,7 @@
           <w:b/>
           <w:sz w:val="22"/>
         </w:rPr>
-        <w:t>Текущий релиз: v4.0.0</w:t>
+        <w:t>Текущий релиз: v4.0.1</w:t>
       </w:r>
     </w:p>
     <w:sectPr>

</xml_diff>